<commit_message>
Add profile photo to all CV versions
Co-authored-by: arena-agent <297053741+arena-agent@users.noreply.github.com>
</commit_message>
<xml_diff>
--- a/CV/Ahmed_AbdelNaby_CV_AR.docx
+++ b/CV/Ahmed_AbdelNaby_CV_AR.docx
@@ -4,6 +4,7 @@
   <w:body>
     <w:tbl>
       <w:tblPr>
+        <w:bidiVisual/>
         <w:tblW w:type="dxa" w:w="9752"/>
         <w:jc w:val="center"/>
         <w:tblBorders>
@@ -18,12 +19,13 @@
         <w:tblLook w:firstColumn="1" w:firstRow="1" w:lastColumn="0" w:lastRow="0" w:noHBand="0" w:noVBand="1" w:val="04A0"/>
       </w:tblPr>
       <w:tblGrid>
-        <w:gridCol w:w="9752"/>
+        <w:gridCol w:w="7938"/>
+        <w:gridCol w:w="1814"/>
       </w:tblGrid>
       <w:tr>
         <w:tc>
           <w:tcPr>
-            <w:tcW w:type="dxa" w:w="9751"/>
+            <w:tcW w:type="dxa" w:w="7937"/>
             <w:tcBorders>
               <w:bottom w:val="single" w:sz="18" w:space="0" w:color="A28040"/>
             </w:tcBorders>
@@ -34,6 +36,7 @@
               <w:bottom w:w="210" w:type="dxa"/>
               <w:right w:w="300" w:type="dxa"/>
             </w:tcMar>
+            <w:vAlign w:val="center"/>
           </w:tcPr>
           <w:p>
             <w:pPr>
@@ -47,8 +50,8 @@
                 <w:b/>
                 <w:bCs w:val="1"/>
                 <w:color w:val="FFFFFF"/>
-                <w:sz w:val="48"/>
-                <w:szCs w:val="48"/>
+                <w:sz w:val="44"/>
+                <w:szCs w:val="44"/>
                 <w:rtl/>
               </w:rPr>
               <w:t>أحمد عبد النبي عبد العظيم</w:t>
@@ -88,6 +91,62 @@
                 <w:rtl/>
               </w:rPr>
               <w:t>هاتف: 01222500093</w:t>
+            </w:r>
+          </w:p>
+        </w:tc>
+        <w:tc>
+          <w:tcPr>
+            <w:tcW w:type="dxa" w:w="1814"/>
+            <w:tcBorders>
+              <w:bottom w:val="single" w:sz="18" w:space="0" w:color="A28040"/>
+            </w:tcBorders>
+            <w:shd w:val="clear" w:color="auto" w:fill="102440"/>
+            <w:tcMar>
+              <w:top w:w="150" w:type="dxa"/>
+              <w:left w:w="140" w:type="dxa"/>
+              <w:bottom w:w="150" w:type="dxa"/>
+              <w:right w:w="140" w:type="dxa"/>
+            </w:tcMar>
+            <w:vAlign w:val="center"/>
+          </w:tcPr>
+          <w:p>
+            <w:pPr>
+              <w:spacing w:before="0" w:after="0" w:line="240" w:lineRule="auto"/>
+              <w:jc w:val="center"/>
+            </w:pPr>
+            <w:r>
+              <w:drawing>
+                <wp:inline xmlns:a="http://schemas.openxmlformats.org/drawingml/2006/main" xmlns:pic="http://schemas.openxmlformats.org/drawingml/2006/picture">
+                  <wp:extent cx="827999" cy="827999"/>
+                  <wp:docPr id="1" name="Picture 1"/>
+                  <wp:cNvGraphicFramePr>
+                    <a:graphicFrameLocks noChangeAspect="1"/>
+                  </wp:cNvGraphicFramePr>
+                  <a:graphic>
+                    <a:graphicData uri="http://schemas.openxmlformats.org/drawingml/2006/picture">
+                      <pic:pic>
+                        <pic:nvPicPr>
+                          <pic:cNvPr id="0" name="photo_circle_docx.png"/>
+                          <pic:cNvPicPr/>
+                        </pic:nvPicPr>
+                        <pic:blipFill>
+                          <a:blip r:embed="rId9"/>
+                          <a:stretch>
+                            <a:fillRect/>
+                          </a:stretch>
+                        </pic:blipFill>
+                        <pic:spPr>
+                          <a:xfrm>
+                            <a:off x="0" y="0"/>
+                            <a:ext cx="827999" cy="827999"/>
+                          </a:xfrm>
+                          <a:prstGeom prst="rect"/>
+                        </pic:spPr>
+                      </pic:pic>
+                    </a:graphicData>
+                  </a:graphic>
+                </wp:inline>
+              </w:drawing>
             </w:r>
           </w:p>
         </w:tc>
@@ -1180,7 +1239,7 @@
       </w:r>
     </w:p>
     <w:sectPr>
-      <w:footerReference w:type="default" r:id="rId9"/>
+      <w:footerReference w:type="default" r:id="rId10"/>
       <w:pgSz w:w="11906" w:h="16838"/>
       <w:pgMar w:top="454" w:right="1077" w:bottom="850" w:left="1077" w:header="283" w:footer="454" w:gutter="0"/>
       <w:cols w:space="720"/>

</xml_diff>